<commit_message>
Agente: agrupa enunciados da mesma decisão e mostra a tese completa no relatório
Co-Authored-By: Claude Opus 5.5 <noreply@anthropic.com>
Claude-Session: https://claude.ai/code/session_01RLe2xdXQHKBRxDog7T5aQm
</commit_message>
<xml_diff>
--- a/agente/testes/pncp-06716880000183-2026-22/relatorio.docx
+++ b/agente/testes/pncp-06716880000183-2026-22/relatorio.docx
@@ -521,10 +521,22 @@
         <w:rPr>
           <w:b/>
         </w:rPr>
-        <w:t xml:space="preserve">TCU · Acórdão 1347/2018-Plenário (2018-06-13): </w:t>
+        <w:t>TCU · Acórdão 1347/2018-Plenário (13/06/2018) — 2 enunciados distintos da mesma decisão</w:t>
+      </w:r>
+    </w:p>
+    <w:p>
+      <w:pPr>
+        <w:spacing w:after="40"/>
+        <w:ind w:left="680"/>
+      </w:pPr>
+      <w:r>
+        <w:rPr>
+          <w:b/>
+        </w:rPr>
+        <w:t xml:space="preserve">Enunciado 1: </w:t>
       </w:r>
       <w:r>
-        <w:t xml:space="preserve">Nas licitações para registro de preços, a modelagem de aquisição por preço global de grupo de itens é medida excepcional que precisa ser devidamente justificada, a… </w:t>
+        <w:t xml:space="preserve">Nas licitações para registro de preços, a modelagem de aquisição por preço global de grupo de itens é medida excepcional que precisa ser devidamente justificada, a ser utilizada apenas nos casos em que a Administração pretende contratar a totalidade dos itens do grupo, respeitadas as proporções de quantitativos definidos no certame. Apesar de essa modelagem ser, em regra, incompatível com a aquisição futura de itens isoladamente, admite-se tal hipótese quando o preço unitário ofertado pelo vencedor do grupo for o menor lance válido na disputa relativa ao item. </w:t>
       </w:r>
       <w:hyperlink r:id="rId9">
         <w:r>
@@ -538,17 +550,17 @@
     </w:p>
     <w:p>
       <w:pPr>
-        <w:pStyle w:val="ListBullet"/>
         <w:spacing w:after="40"/>
+        <w:ind w:left="680"/>
       </w:pPr>
       <w:r>
         <w:rPr>
           <w:b/>
         </w:rPr>
-        <w:t xml:space="preserve">TCU · Acórdão 1347/2018-Plenário (2018-06-13): </w:t>
+        <w:t xml:space="preserve">Enunciado 2: </w:t>
       </w:r>
       <w:r>
-        <w:t xml:space="preserve">No sistema de registro de preços com critério de adjudicação pelo menor preço global por grupo (lote) de itens, não é admissível aquisição junto a empresa que… </w:t>
+        <w:t xml:space="preserve">No sistema de registro de preços com critério de adjudicação pelo menor preço global por grupo (lote) de itens, não é admissível aquisição junto a empresa que apresentou a melhor proposta para determinado item, mas que não foi vencedora do respectivo grupo, uma vez que a licitação para registro de preços objetiva a convocação dos fornecedores mais bem classificados para assinar as atas, sendo possível, única e exclusivamente, contratação com as empresas vencedoras para fornecimento dos itens nelas registrados. </w:t>
       </w:r>
       <w:hyperlink r:id="rId10">
         <w:r>
@@ -751,10 +763,13 @@
         <w:rPr>
           <w:b/>
         </w:rPr>
-        <w:t xml:space="preserve">TCU · Acórdão 2921/2026-Plenário – TC 021.316/2026-0 (2026-10-21): </w:t>
+        <w:t>TCU · Acórdão 2921/2026-Plenário – TC 021.316/2026-0 (21/10/2026):</w:t>
       </w:r>
       <w:r>
-        <w:t xml:space="preserve">Prazo mínimo de propostas conta do primeiro dia útil após a divulgação do edital no PNCP; encerrá-lo antes é falha, sem anulação se houve competição e não há prejuízo </w:t>
+        <w:t xml:space="preserve"> </w:t>
+      </w:r>
+      <w:r>
+        <w:t xml:space="preserve">Denúncia sobre pregão eletrônico para coletes balísticos (eleições 2026; estimado R$ 3,2 milhões). O prazo mínimo para apresentação de propostas é contado a partir do primeiro dia útil seguinte à divulgação do edital no PNCP (art. 183, caput e § 1º, I, da Lei 14.133/2021). O recebimento foi encerrado antes do fim desse prazo, mas houve competição efetiva e não se demonstrou prejuízo: parcialmente procedente, com ciência e arquivamento. Ata 41/2026; conferido na base oficial do TCU. </w:t>
       </w:r>
       <w:hyperlink r:id="rId11">
         <w:r>
@@ -942,10 +957,13 @@
         <w:rPr>
           <w:b/>
         </w:rPr>
-        <w:t xml:space="preserve">TCU · Acórdão 1635/2026-Plenário (2026-06-24): </w:t>
+        <w:t>TCU · Acórdão 1635/2026-Plenário (24/06/2026):</w:t>
       </w:r>
       <w:r>
-        <w:t xml:space="preserve">É irregular a utilização de orçamento sigiloso (art. 24 da Lei 14.133/2021) sem justificativa adequada que indique a vantajosidade para o procedimento de contratação </w:t>
+        <w:t xml:space="preserve"> </w:t>
+      </w:r>
+      <w:r>
+        <w:t xml:space="preserve">É irregular a utilização de orçamento sigiloso (art. 24 da Lei 14.133/2021) sem justificativa adequada que indique a vantajosidade para o procedimento de contratação. </w:t>
       </w:r>
       <w:hyperlink r:id="rId12">
         <w:r>
@@ -966,10 +984,13 @@
         <w:rPr>
           <w:b/>
         </w:rPr>
-        <w:t xml:space="preserve">TCU · Acórdão 2190/2024-Plenário (2024-10-16): </w:t>
+        <w:t>TCU · Acórdão 2190/2024-Plenário (16/10/2024):</w:t>
       </w:r>
       <w:r>
-        <w:t xml:space="preserve">Nas licitações regidas pela Lei 14.133/2021, deve ser permitida a abertura do sigilo do custo estimado da contratação após a fase de lances, quando as propostas… </w:t>
+        <w:t xml:space="preserve"> </w:t>
+      </w:r>
+      <w:r>
+        <w:t xml:space="preserve">Nas licitações regidas pela Lei 14.133/2021, deve ser permitida a abertura do sigilo do custo estimado da contratação após a fase de lances, quando as propostas permanecerem com preços acima dos de referência, desde que em ato público e com a devida justificativa, de modo a tornar a fase de negociação de preços com os licitantes mais efetiva e evitar a ocorrência de tratamento não isonômico. </w:t>
       </w:r>
       <w:hyperlink r:id="rId13">
         <w:r>
@@ -1216,10 +1237,13 @@
         <w:rPr>
           <w:b/>
         </w:rPr>
-        <w:t xml:space="preserve">TCU · Acórdão 1851/2022-Plenário (2022-08-10): </w:t>
+        <w:t>TCU · Acórdão 1851/2022-Plenário (10/08/2022):</w:t>
       </w:r>
       <w:r>
-        <w:t xml:space="preserve">Não é juridicamente possível o aproveitamento, por órgão federal, de contrato já firmado por órgão estadual ou municipal </w:t>
+        <w:t xml:space="preserve"> </w:t>
+      </w:r>
+      <w:r>
+        <w:t xml:space="preserve">Não é juridicamente possível o aproveitamento, por órgão federal, de contrato já firmado por órgão estadual ou municipal. O único instrumento legal que possibilita determinado órgão se beneficiar de licitação realizada por outro é a adesão a ata de registro de preços, no âmbito do Sistema de Registro de Preços (SRP); porém é vedada, pelo art. 22, § 8º, do Decreto 7.892/2013 e pelo art. 86, § 8º, da Lei 14.133/2021, aos órgãos e entidades da Administração Pública Federal a adesão a ata de registro de preços gerenciada por órgão ou entidade estadual, distrital ou municipal. </w:t>
       </w:r>
       <w:hyperlink r:id="rId14">
         <w:r>
@@ -1240,10 +1264,13 @@
         <w:rPr>
           <w:b/>
         </w:rPr>
-        <w:t xml:space="preserve">TCE-RJ · Acórdão 49600/2025 – Processo 228.123-0/2025 (2025-10-06): </w:t>
+        <w:t>TCE-RJ · Acórdão 49600/2025 – Processo 228.123-0/2025 (06/10/2025):</w:t>
       </w:r>
       <w:r>
-        <w:t xml:space="preserve">A adesão à ata de registro de preços por ente não participante da licitação originária, ou “adesão carona”, está prevista expressamente nos arts </w:t>
+        <w:t xml:space="preserve"> </w:t>
+      </w:r>
+      <w:r>
+        <w:t xml:space="preserve">A adesão à ata de registro de preços por ente não participante da licitação originária, ou “adesão carona”, está prevista expressamente nos arts. 82 a 86 da Lei nº 14.133/2021 e encontra fundamento no princípio da eficiência administrativa, desde que seu uso se dê com observância aos princípios da legalidade, da economicidade, do planejamento e da motivação. </w:t>
       </w:r>
       <w:hyperlink r:id="rId15">
         <w:r>
@@ -1477,10 +1504,13 @@
         <w:rPr>
           <w:b/>
         </w:rPr>
-        <w:t xml:space="preserve">TCU · Acórdão 2272/2026-Plenário (2026-08-25): </w:t>
+        <w:t>TCU · Acórdão 2272/2026-Plenário (25/08/2026):</w:t>
       </w:r>
       <w:r>
-        <w:t xml:space="preserve">Diferença significativa entre os quantitativos mínimos e máximos previstos em licitação para registro de preços (art </w:t>
+        <w:t xml:space="preserve"> </w:t>
+      </w:r>
+      <w:r>
+        <w:t xml:space="preserve">Diferença significativa entre os quantitativos mínimos e máximos previstos em licitação para registro de preços (art. 82, incisos I e II, da Lei 14.133/2021) não configura, por si só, ilegalidade ou antieconomicidade do certame, desde que os quantitativos estejam tecnicamente justificados no planejamento da contratação. Eventual comprometimento da competitividade, da economicidade ou da obtenção da proposta mais vantajosa para a Administração deve ser demonstrado por elementos concretos, a exemplo de estudos de mercado e dados relativos à participação em certames anteriores. </w:t>
       </w:r>
       <w:hyperlink r:id="rId16">
         <w:r>
@@ -1501,10 +1531,13 @@
         <w:rPr>
           <w:b/>
         </w:rPr>
-        <w:t xml:space="preserve">TCU · Acórdão 1564/2025-Plenário (2025-07-16): </w:t>
+        <w:t>TCU · Acórdão 1564/2025-Plenário (16/07/2025):</w:t>
       </w:r>
       <w:r>
-        <w:t xml:space="preserve">Em licitação para registro de preços que permita cotação parcial (art </w:t>
+        <w:t xml:space="preserve"> </w:t>
+      </w:r>
+      <w:r>
+        <w:t xml:space="preserve">Em licitação para registro de preços que permita cotação parcial (art. 82, inciso IV, da Lei 14.133/2021), caso a proposta de menor preço seja para quantitativo inferior ao máximo previsto no edital, é irregular a desclassificação de licitantes que apresentaram preços abaixo do valor de referência para todo o quantitativo licitado, mas que não igualaram o preço da melhor proposta. Tal procedimento impede a formação do cadastro de reserva e, na prática, inviabiliza o fornecimento do saldo remanescente. </w:t>
       </w:r>
       <w:hyperlink r:id="rId17">
         <w:r>
@@ -1707,10 +1740,13 @@
         <w:rPr>
           <w:b/>
         </w:rPr>
-        <w:t xml:space="preserve">TCU · Acórdão 2910/2026-Plenário – TC 006.933/2025-4 (2026-10-21): </w:t>
+        <w:t>TCU · Acórdão 2910/2026-Plenário – TC 006.933/2025-4 (21/10/2026):</w:t>
       </w:r>
       <w:r>
-        <w:t xml:space="preserve">Superestimar itens para comercializá-los na ata de registro de preços ('barriga de aluguel') é irregular </w:t>
+        <w:t xml:space="preserve"> </w:t>
+      </w:r>
+      <w:r>
+        <w:t xml:space="preserve">Representação sobre certame para mobiliário em que itens foram superestimados para comercialização na ata de registro de preços (prática de 'barriga de aluguel'). Empresas e agentes ouvidos em audiência; um revel e demais razões rejeitadas. Não se aplicou multa porque alguns responsáveis já haviam sido sancionados por outras irregularidades no mesmo certame; apensamento. Sumário oficial não cita dispositivos legais. Ata 41/2026; conferido na base oficial do TCU. </w:t>
       </w:r>
       <w:hyperlink r:id="rId18">
         <w:r>
@@ -1731,10 +1767,13 @@
         <w:rPr>
           <w:b/>
         </w:rPr>
-        <w:t xml:space="preserve">TCU · Acórdão 1387/2026-Plenário (2026-05-27): </w:t>
+        <w:t>TCU · Acórdão 1387/2026-Plenário (27/05/2026):</w:t>
       </w:r>
       <w:r>
-        <w:t xml:space="preserve">Em edital de registro de preços que não indique a estimativa dos quantitativos a serem contratados, é irregular a previsão de adesão de órgãos não participantes… </w:t>
+        <w:t xml:space="preserve"> </w:t>
+      </w:r>
+      <w:r>
+        <w:t xml:space="preserve">Em edital de registro de preços que não indique a estimativa dos quantitativos a serem contratados, é irregular a previsão de adesão de órgãos não participantes (caronas), por contrariar os arts. 82, § 4º, e 86, §§ 4º e 5º, da Lei 14.133/2021. </w:t>
       </w:r>
       <w:hyperlink r:id="rId19">
         <w:r>
@@ -2077,10 +2116,13 @@
         <w:rPr>
           <w:b/>
         </w:rPr>
-        <w:t xml:space="preserve">TCU · Acórdão 25/2026-Plenário (2026-01-21): </w:t>
+        <w:t>TCU · Acórdão 25/2026-Plenário (21/01/2026):</w:t>
       </w:r>
       <w:r>
-        <w:t xml:space="preserve">A vedação à participação de empresas em consórcio sem a apresentação, nos autos do processo licitatório, de justificativa técnica que demonstre a incompatibilidade… </w:t>
+        <w:t xml:space="preserve"> </w:t>
+      </w:r>
+      <w:r>
+        <w:t xml:space="preserve">A vedação à participação de empresas em consórcio sem a apresentação, nos autos do processo licitatório, de justificativa técnica que demonstre a incompatibilidade dessa forma de associação com as características do objeto demandado afronta o art. 15 da Lei 14.133/2021. </w:t>
       </w:r>
       <w:hyperlink r:id="rId20">
         <w:r>
@@ -2101,7 +2143,10 @@
         <w:rPr>
           <w:b/>
         </w:rPr>
-        <w:t xml:space="preserve">TCM-RJ · Voto 136/2026 · Proc. 040/100611/2026 · Enunciado 143 (2026-03-11): </w:t>
+        <w:t>TCM-RJ · Voto 136/2026 · Proc. 040/100611/2026 · Enunciado 143 (11/03/2026):</w:t>
+      </w:r>
+      <w:r>
+        <w:t xml:space="preserve"> </w:t>
       </w:r>
       <w:r>
         <w:t xml:space="preserve">A vedação da participação de consórcios em licitação deve ser justificada pela Administração </w:t>

</xml_diff>